<commit_message>
Update Blattabacterium HGT manuscript_responses to reviews_2026-04-13.docx
</commit_message>
<xml_diff>
--- a/manuscript/revision/Blattabacterium HGT manuscript_responses to reviews_2026-04-13.docx
+++ b/manuscript/revision/Blattabacterium HGT manuscript_responses to reviews_2026-04-13.docx
@@ -104,98 +104,116 @@
           <w:bCs/>
           <w:color w:val="2F5496" w:themeColor="accent1" w:themeShade="BF"/>
         </w:rPr>
-        <w:t>R1.</w:t>
-      </w:r>
-      <w:r>
-        <w:rPr>
-          <w:color w:val="2F5496" w:themeColor="accent1" w:themeShade="BF"/>
-        </w:rPr>
-        <w:t xml:space="preserve"> </w:t>
-      </w:r>
-      <w:r>
-        <w:rPr>
-          <w:color w:val="2F5496" w:themeColor="accent1" w:themeShade="BF"/>
-        </w:rPr>
-        <w:t xml:space="preserve">Excellent paper which applies novel thinking to the "big question" of how symbiont genomes influence their host genomes over long evolutionary time. Targeting of small, non-coding DNA insertions and utilising long-read sequencing to avoid the limitations of 'standard' short-read methods is a frankly inspired approach, and sets up a clear evolutionary interpretation - while long, coding sequences rarely undergo HGT (either are broken up in the process or eliminated from host genome by selection), short, non-coding HGT is abundant. At least when a species has an obligate linearly-transmitted endosymbiont. QC methods around all of this are very strong, and the sequencing of a multiple host species across a well-established evolutionary radiation further bolsters the significance of their findings. I am confident that the conclusions found are not result of methodological artefacts, 'lucky' choice of target species or other aspects which would limit </w:t>
-      </w:r>
-      <w:proofErr w:type="spellStart"/>
-      <w:proofErr w:type="gramStart"/>
-      <w:r>
-        <w:rPr>
-          <w:color w:val="2F5496" w:themeColor="accent1" w:themeShade="BF"/>
-        </w:rPr>
-        <w:t>it's</w:t>
-      </w:r>
-      <w:proofErr w:type="spellEnd"/>
-      <w:proofErr w:type="gramEnd"/>
-      <w:r>
-        <w:rPr>
-          <w:color w:val="2F5496" w:themeColor="accent1" w:themeShade="BF"/>
-        </w:rPr>
-        <w:t xml:space="preserve"> general applicability. I feel that this paper is likely to open new investigatory lines within endosymbiont/microbiome research and lead to </w:t>
-      </w:r>
-      <w:proofErr w:type="spellStart"/>
-      <w:r>
-        <w:rPr>
-          <w:color w:val="2F5496" w:themeColor="accent1" w:themeShade="BF"/>
-        </w:rPr>
-        <w:t>reexamination</w:t>
-      </w:r>
-      <w:proofErr w:type="spellEnd"/>
-      <w:r>
-        <w:rPr>
-          <w:color w:val="2F5496" w:themeColor="accent1" w:themeShade="BF"/>
-        </w:rPr>
-        <w:t xml:space="preserve"> of systems previously considered to lack HGT.</w:t>
-      </w:r>
-    </w:p>
-    <w:p>
-      <w:pPr>
-        <w:rPr>
-          <w:color w:val="000000" w:themeColor="text1"/>
-        </w:rPr>
-      </w:pPr>
+        <w:t>R1</w:t>
+      </w:r>
       <w:r>
         <w:rPr>
           <w:b/>
           <w:bCs/>
-          <w:color w:val="000000" w:themeColor="text1"/>
-        </w:rPr>
-        <w:t>R</w:t>
-      </w:r>
+          <w:color w:val="2F5496" w:themeColor="accent1" w:themeShade="BF"/>
+        </w:rPr>
+        <w:t>.1</w:t>
+      </w:r>
+      <w:bookmarkStart w:id="0" w:name="_GoBack"/>
+      <w:bookmarkEnd w:id="0"/>
       <w:r>
         <w:rPr>
           <w:b/>
           <w:bCs/>
-          <w:color w:val="000000" w:themeColor="text1"/>
-        </w:rPr>
-        <w:t>esponse:</w:t>
-      </w:r>
-      <w:r>
-        <w:rPr>
-          <w:color w:val="000000" w:themeColor="text1"/>
-        </w:rPr>
-        <w:t xml:space="preserve"> We thank reviewer 1 for their kind </w:t>
-      </w:r>
-      <w:r>
-        <w:rPr>
-          <w:color w:val="000000" w:themeColor="text1"/>
-        </w:rPr>
-        <w:t xml:space="preserve">and thoughtful </w:t>
-      </w:r>
-      <w:r>
-        <w:rPr>
-          <w:color w:val="000000" w:themeColor="text1"/>
-        </w:rPr>
-        <w:t xml:space="preserve">comments. </w:t>
-      </w:r>
-    </w:p>
-    <w:p/>
-    <w:p>
-      <w:pPr>
+          <w:color w:val="2F5496" w:themeColor="accent1" w:themeShade="BF"/>
+        </w:rPr>
+        <w:t>.</w:t>
+      </w:r>
+      <w:r>
+        <w:rPr>
+          <w:color w:val="2F5496" w:themeColor="accent1" w:themeShade="BF"/>
+        </w:rPr>
+        <w:t xml:space="preserve"> </w:t>
+      </w:r>
+      <w:r>
+        <w:rPr>
+          <w:color w:val="2F5496" w:themeColor="accent1" w:themeShade="BF"/>
+        </w:rPr>
+        <w:t xml:space="preserve">Excellent paper which applies novel thinking to the "big question" of how symbiont genomes influence their host genomes over long evolutionary time. Targeting of small, non-coding DNA insertions and utilising long-read sequencing to avoid the limitations of 'standard' short-read methods is a frankly inspired approach, and sets up a clear evolutionary interpretation - while long, coding sequences rarely undergo HGT (either are broken up in the process or eliminated from host genome by selection), short, non-coding HGT is abundant. At least when a species has an obligate linearly-transmitted endosymbiont. QC methods around all of this are very strong, and the sequencing of a multiple host species across a well-established evolutionary radiation further bolsters the significance of their findings. I am confident that the conclusions found are not result of methodological artefacts, 'lucky' choice of target species or other aspects which would limit </w:t>
+      </w:r>
+      <w:proofErr w:type="spellStart"/>
+      <w:proofErr w:type="gramStart"/>
+      <w:r>
+        <w:rPr>
+          <w:color w:val="2F5496" w:themeColor="accent1" w:themeShade="BF"/>
+        </w:rPr>
+        <w:t>it's</w:t>
+      </w:r>
+      <w:proofErr w:type="spellEnd"/>
+      <w:proofErr w:type="gramEnd"/>
+      <w:r>
+        <w:rPr>
+          <w:color w:val="2F5496" w:themeColor="accent1" w:themeShade="BF"/>
+        </w:rPr>
+        <w:t xml:space="preserve"> general applicability. I feel that this paper is likely to open new investigatory lines within endosymbiont/microbiome research and lead to </w:t>
+      </w:r>
+      <w:proofErr w:type="spellStart"/>
+      <w:r>
+        <w:rPr>
+          <w:color w:val="2F5496" w:themeColor="accent1" w:themeShade="BF"/>
+        </w:rPr>
+        <w:t>reexamination</w:t>
+      </w:r>
+      <w:proofErr w:type="spellEnd"/>
+      <w:r>
+        <w:rPr>
+          <w:color w:val="2F5496" w:themeColor="accent1" w:themeShade="BF"/>
+        </w:rPr>
+        <w:t xml:space="preserve"> of systems previously considered to lack HGT.</w:t>
+      </w:r>
+    </w:p>
+    <w:p>
+      <w:pPr>
+        <w:rPr>
+          <w:color w:val="000000" w:themeColor="text1"/>
+        </w:rPr>
+      </w:pPr>
+      <w:r>
         <w:rPr>
           <w:b/>
           <w:bCs/>
+          <w:color w:val="000000" w:themeColor="text1"/>
+        </w:rPr>
+        <w:t>R</w:t>
+      </w:r>
+      <w:r>
+        <w:rPr>
+          <w:b/>
+          <w:bCs/>
+          <w:color w:val="000000" w:themeColor="text1"/>
+        </w:rPr>
+        <w:t>esponse:</w:t>
+      </w:r>
+      <w:r>
+        <w:rPr>
+          <w:color w:val="000000" w:themeColor="text1"/>
+        </w:rPr>
+        <w:t xml:space="preserve"> We thank reviewer 1 for their kind </w:t>
+      </w:r>
+      <w:r>
+        <w:rPr>
+          <w:color w:val="000000" w:themeColor="text1"/>
+        </w:rPr>
+        <w:t xml:space="preserve">and thoughtful </w:t>
+      </w:r>
+      <w:r>
+        <w:rPr>
+          <w:color w:val="000000" w:themeColor="text1"/>
+        </w:rPr>
+        <w:t xml:space="preserve">comments. </w:t>
+      </w:r>
+    </w:p>
+    <w:p/>
+    <w:p>
+      <w:pPr>
+        <w:rPr>
+          <w:b/>
+          <w:bCs/>
           <w:color w:val="2F5496" w:themeColor="accent1" w:themeShade="BF"/>
           <w:sz w:val="28"/>
           <w:szCs w:val="28"/>
@@ -404,19 +422,19 @@
         </w:rPr>
         <w:t>This analysis is detailed in the Supporting Information (see the last paragraph of the “Characterizing HGT inserts” section), with results presented in Dataset S4. We have added the following text to the manuscript (line</w:t>
       </w:r>
-      <w:commentRangeStart w:id="0"/>
+      <w:commentRangeStart w:id="1"/>
       <w:r>
         <w:rPr>
           <w:color w:val="000000" w:themeColor="text1"/>
         </w:rPr>
         <w:t>s</w:t>
       </w:r>
-      <w:commentRangeEnd w:id="0"/>
+      <w:commentRangeEnd w:id="1"/>
       <w:r>
         <w:rPr>
           <w:rStyle w:val="CommentReference"/>
         </w:rPr>
-        <w:commentReference w:id="0"/>
+        <w:commentReference w:id="1"/>
       </w:r>
       <w:r>
         <w:rPr>
@@ -498,19 +516,19 @@
         </w:rPr>
         <w:t>(Fig #)</w:t>
       </w:r>
-      <w:commentRangeStart w:id="1"/>
+      <w:commentRangeStart w:id="2"/>
       <w:r>
         <w:rPr>
           <w:color w:val="FF0000"/>
         </w:rPr>
         <w:t>.</w:t>
       </w:r>
-      <w:commentRangeEnd w:id="1"/>
+      <w:commentRangeEnd w:id="2"/>
       <w:r>
         <w:rPr>
           <w:rStyle w:val="CommentReference"/>
         </w:rPr>
-        <w:commentReference w:id="1"/>
+        <w:commentReference w:id="2"/>
       </w:r>
       <w:r>
         <w:rPr>
@@ -1205,13 +1223,7 @@
         <w:rPr>
           <w:color w:val="000000" w:themeColor="text1"/>
         </w:rPr>
-        <w:t xml:space="preserve">average = </w:t>
-      </w:r>
-      <w:r>
-        <w:rPr>
-          <w:color w:val="000000" w:themeColor="text1"/>
-        </w:rPr>
-        <w:t>9.5</w:t>
+        <w:t>average = 9.5</w:t>
       </w:r>
       <w:r>
         <w:rPr>
@@ -2372,19 +2384,19 @@
         </w:rPr>
         <w:t xml:space="preserve"> S</w:t>
       </w:r>
-      <w:commentRangeStart w:id="2"/>
+      <w:commentRangeStart w:id="3"/>
       <w:r>
         <w:rPr>
           <w:color w:val="000000" w:themeColor="text1"/>
         </w:rPr>
         <w:t>5</w:t>
       </w:r>
-      <w:commentRangeEnd w:id="2"/>
+      <w:commentRangeEnd w:id="3"/>
       <w:r>
         <w:rPr>
           <w:rStyle w:val="CommentReference"/>
         </w:rPr>
-        <w:commentReference w:id="2"/>
+        <w:commentReference w:id="3"/>
       </w:r>
       <w:r>
         <w:rPr>
@@ -2970,8 +2982,6 @@
         </w:rPr>
         <w:t>96</w:t>
       </w:r>
-      <w:bookmarkStart w:id="3" w:name="_GoBack"/>
-      <w:bookmarkEnd w:id="3"/>
       <w:r>
         <w:rPr>
           <w:color w:val="000000" w:themeColor="text1"/>
@@ -3388,7 +3398,7 @@
 
 <file path=word/comments.xml><?xml version="1.0" encoding="utf-8"?>
 <w:comments xmlns:wpc="http://schemas.microsoft.com/office/word/2010/wordprocessingCanvas" xmlns:cx="http://schemas.microsoft.com/office/drawing/2014/chartex" xmlns:cx1="http://schemas.microsoft.com/office/drawing/2015/9/8/chartex" xmlns:cx2="http://schemas.microsoft.com/office/drawing/2015/10/21/chartex" xmlns:cx3="http://schemas.microsoft.com/office/drawing/2016/5/9/chartex" xmlns:cx4="http://schemas.microsoft.com/office/drawing/2016/5/10/chartex" xmlns:cx5="http://schemas.microsoft.com/office/drawing/2016/5/11/chartex" xmlns:cx6="http://schemas.microsoft.com/office/drawing/2016/5/12/chartex" xmlns:cx7="http://schemas.microsoft.com/office/drawing/2016/5/13/chartex" xmlns:cx8="http://schemas.microsoft.com/office/drawing/2016/5/14/chartex" xmlns:mc="http://schemas.openxmlformats.org/markup-compatibility/2006" xmlns:aink="http://schemas.microsoft.com/office/drawing/2016/ink" xmlns:am3d="http://schemas.microsoft.com/office/drawing/2017/model3d" xmlns:o="urn:schemas-microsoft-com:office:office" xmlns:r="http://schemas.openxmlformats.org/officeDocument/2006/relationships" xmlns:m="http://schemas.openxmlformats.org/officeDocument/2006/math" xmlns:v="urn:schemas-microsoft-com:vml" xmlns:wp14="http://schemas.microsoft.com/office/word/2010/wordprocessingDrawing" xmlns:wp="http://schemas.openxmlformats.org/drawingml/2006/wordprocessingDrawing" xmlns:w10="urn:schemas-microsoft-com:office:word" xmlns:w="http://schemas.openxmlformats.org/wordprocessingml/2006/main" xmlns:w14="http://schemas.microsoft.com/office/word/2010/wordml" xmlns:w15="http://schemas.microsoft.com/office/word/2012/wordml" xmlns:w16cid="http://schemas.microsoft.com/office/word/2016/wordml/cid" xmlns:w16se="http://schemas.microsoft.com/office/word/2015/wordml/symex" xmlns:wpg="http://schemas.microsoft.com/office/word/2010/wordprocessingGroup" xmlns:wpi="http://schemas.microsoft.com/office/word/2010/wordprocessingInk" xmlns:wne="http://schemas.microsoft.com/office/word/2006/wordml" xmlns:wps="http://schemas.microsoft.com/office/word/2010/wordprocessingShape" mc:Ignorable="w14 w15 w16se w16cid wp14">
-  <w:comment w:id="0" w:author="Microsoft Office User" w:date="2026-04-13T16:07:00Z" w:initials="MOU">
+  <w:comment w:id="1" w:author="Microsoft Office User" w:date="2026-04-13T16:07:00Z" w:initials="MOU">
     <w:p>
       <w:pPr>
         <w:pStyle w:val="CommentText"/>
@@ -3404,7 +3414,7 @@
       </w:r>
     </w:p>
   </w:comment>
-  <w:comment w:id="1" w:author="Microsoft Office User" w:date="2026-04-03T08:35:00Z" w:initials="MOU">
+  <w:comment w:id="2" w:author="Microsoft Office User" w:date="2026-04-03T08:35:00Z" w:initials="MOU">
     <w:p>
       <w:pPr>
         <w:pStyle w:val="CommentText"/>
@@ -3423,7 +3433,7 @@
       </w:r>
     </w:p>
   </w:comment>
-  <w:comment w:id="2" w:author="Microsoft Office User" w:date="2026-04-03T11:07:00Z" w:initials="MOU">
+  <w:comment w:id="3" w:author="Microsoft Office User" w:date="2026-04-03T11:07:00Z" w:initials="MOU">
     <w:p>
       <w:pPr>
         <w:pStyle w:val="CommentText"/>

</xml_diff>